<commit_message>
Update SAP access mechanism to daily email export; remove headcount framing
SAP data now arrives via a daily automated export emailed by the
logistics team (confirmed workable), replacing the live "SAP read
access" dependency throughout — architecture section, summary table,
the ask, and the risk table (now marked mitigated instead of top
risk). Removed the now-resolved "is SAP access weeks or quarters"
open question.

Also removed every "headcount" mention (both the "won't reduce
headcount" reassurance and the "no headcount needed" cost framing),
rewording each sentence to read naturally without it.

Co-Authored-By: Claude Sonnet 5 <noreply@anthropic.com>
</commit_message>
<xml_diff>
--- a/Inbound_Data_Layer_Proposal.docx
+++ b/Inbound_Data_Layer_Proposal.docx
@@ -554,7 +554,7 @@
                 <w:sz w:val="20"/>
                 <w:szCs w:val="20"/>
               </w:rPr>
-              <w:t xml:space="preserve">Existing engineering time. No headcount, no new licences, no new platform</w:t>
+              <w:t>Existing engineering time. No new licences, no new platform</w:t>
             </w:r>
           </w:p>
         </w:tc>
@@ -778,7 +778,7 @@
                 <w:sz w:val="20"/>
                 <w:szCs w:val="20"/>
               </w:rPr>
-              <w:t xml:space="preserve">SAP read access, a named supply chain owner, ~2 hours per week of SME time, QA/CSV classification review, a shared booking mailbox</w:t>
+              <w:t>A daily automated SAP export (emailed by logistics, confirmed workable at a 24-hour cadence) for the inbound data set — purchase orders, goods receipts, material and batch master — plus a named supply chain owner, ~2 hours per week of SME time, QA/CSV classification review, and a shared booking mailbox</w:t>
             </w:r>
           </w:p>
         </w:tc>
@@ -2770,16 +2770,15 @@
           <w:sz w:val="22"/>
           <w:szCs w:val="22"/>
         </w:rPr>
-        <w:t xml:space="preserve">Raw landing. </w:t>
-      </w:r>
-      <w:r>
-        <w:rPr>
-          <w:rFonts w:ascii="Calibri" w:cs="Calibri" w:eastAsia="Calibri" w:hAnsi="Calibri"/>
-          <w:color w:val="16181A"/>
-          <w:sz w:val="22"/>
-          <w:szCs w:val="22"/>
-        </w:rPr>
-        <w:t xml:space="preserve">Each source is pulled on a schedule and stored exactly as received, immutable and timestamped. This gives replay after a transform error and an audit trail when a number is disputed.</w:t>
+        <w:t>Raw landing. Each source is pulled on a schedule and stored exactly as received, immutable and timestamped. For SAP specifically, this is a daily automated export emailed by the logistics team and loaded into the layer every 24 hours — confirmed workable with logistics, and the only source handled this way. This gives replay after a transform error and an audit trail when a number is disputed.</w:t>
+      </w:r>
+      <w:r>
+        <w:rPr>
+          <w:rFonts w:ascii="Calibri" w:cs="Calibri" w:eastAsia="Calibri" w:hAnsi="Calibri"/>
+          <w:color w:val="16181A"/>
+          <w:sz w:val="22"/>
+          <w:szCs w:val="22"/>
+        </w:rPr>
       </w:r>
     </w:p>
     <w:p>
@@ -3327,16 +3326,15 @@
           <w:sz w:val="22"/>
           <w:szCs w:val="22"/>
         </w:rPr>
-        <w:t xml:space="preserve">2. Capacity returned to planners. </w:t>
-      </w:r>
-      <w:r>
-        <w:rPr>
-          <w:rFonts w:ascii="Calibri" w:cs="Calibri" w:eastAsia="Calibri" w:hAnsi="Calibri"/>
-          <w:color w:val="16181A"/>
-          <w:sz w:val="22"/>
-          <w:szCs w:val="22"/>
-        </w:rPr>
-        <w:t xml:space="preserve">Roughly 350 hours per year is spent creating IRQ entries, most of it SAP lookup and retyping. Conservatively around 250 hours is recoverable; the remainder is genuine scheduling judgement that stays with the planner. This is capacity to absorb volume, not a headcount reduction.</w:t>
+        <w:t>2. Capacity returned to planners. Roughly 350 hours per year is spent creating IRQ entries, most of it SAP lookup and retyping. Conservatively around 250 hours is recoverable; the remainder is genuine scheduling judgement that stays with the planner. This is capacity to absorb volume.</w:t>
+      </w:r>
+      <w:r>
+        <w:rPr>
+          <w:rFonts w:ascii="Calibri" w:cs="Calibri" w:eastAsia="Calibri" w:hAnsi="Calibri"/>
+          <w:color w:val="16181A"/>
+          <w:sz w:val="22"/>
+          <w:szCs w:val="22"/>
+        </w:rPr>
       </w:r>
     </w:p>
     <w:p>
@@ -6562,7 +6560,7 @@
                 <w:sz w:val="20"/>
                 <w:szCs w:val="20"/>
               </w:rPr>
-              <w:t xml:space="preserve">SAP read access takes months to approve</w:t>
+              <w:t>SAP export cadence turns out too slow for a use case</w:t>
             </w:r>
           </w:p>
         </w:tc>
@@ -6589,7 +6587,7 @@
                 <w:sz w:val="20"/>
                 <w:szCs w:val="20"/>
               </w:rPr>
-              <w:t xml:space="preserve">Blocks Phase 1 entirely</w:t>
+              <w:t>Reduced usefulness for same-day escalation only</w:t>
             </w:r>
           </w:p>
         </w:tc>
@@ -6616,7 +6614,7 @@
                 <w:sz w:val="20"/>
                 <w:szCs w:val="20"/>
               </w:rPr>
-              <w:t xml:space="preserve">Longest-lead item; request submitted before development starts. Check first whether an existing warehouse extract already carries this data</w:t>
+              <w:t>Mitigated: logistics has confirmed a daily automated email export works for Phase 1 scope. No SAP read-access approval required. Revisit cadence if a later phase needs tighter escalation timing</w:t>
             </w:r>
           </w:p>
         </w:tc>
@@ -7311,16 +7309,15 @@
           <w:sz w:val="22"/>
           <w:szCs w:val="22"/>
         </w:rPr>
-        <w:t xml:space="preserve">What this will not do. </w:t>
-      </w:r>
-      <w:r>
-        <w:rPr>
-          <w:rFonts w:ascii="Calibri" w:cs="Calibri" w:eastAsia="Calibri" w:hAnsi="Calibri"/>
-          <w:color w:val="16181A"/>
-          <w:sz w:val="22"/>
-          <w:szCs w:val="22"/>
-        </w:rPr>
-        <w:t xml:space="preserve">It will not reduce headcount. It will not fix data quality at the point of entry — the match rate and drift count make existing quality visible rather than repair it. It will not retire any application unless an owner decides to. It will not predict anything in year one. And it does not replace SAP, LIMS or any validated system in any phase.</w:t>
+        <w:t>What this will not do. It will not fix data quality at the point of entry — the match rate and drift count make existing quality visible rather than repair it. It will not retire any application unless an owner decides to. It will not predict anything in year one. And it does not replace SAP, LIMS or any validated system in any phase.</w:t>
+      </w:r>
+      <w:r>
+        <w:rPr>
+          <w:rFonts w:ascii="Calibri" w:cs="Calibri" w:eastAsia="Calibri" w:hAnsi="Calibri"/>
+          <w:color w:val="16181A"/>
+          <w:sz w:val="22"/>
+          <w:szCs w:val="22"/>
+        </w:rPr>
       </w:r>
     </w:p>
     <w:p>
@@ -7351,7 +7348,7 @@
           <w:sz w:val="22"/>
           <w:szCs w:val="22"/>
         </w:rPr>
-        <w:t xml:space="preserve">Approval of Phase 1 only. No headcount, no new licences, no new platform. The cost is existing engineering time for six to eight weeks.</w:t>
+        <w:t>Approval of Phase 1 only. No new licences, no new platform. The cost is existing engineering time for six to eight weeks.</w:t>
       </w:r>
     </w:p>
     <w:p>
@@ -7387,7 +7384,7 @@
           <w:sz w:val="22"/>
           <w:szCs w:val="22"/>
         </w:rPr>
-        <w:t xml:space="preserve">Read access to SAP for the inbound data set — purchase orders, goods receipts, material and batch master</w:t>
+        <w:t>A daily automated SAP export for the inbound data set — purchase orders, goods receipts, material and batch master — emailed by the logistics team and loaded on a 24-hour cadence; confirmed workable with logistics</w:t>
       </w:r>
     </w:p>
     <w:p>
@@ -7664,25 +7661,6 @@
           <w:szCs w:val="22"/>
         </w:rPr>
         <w:t xml:space="preserve">Who is the named business owner, and will they co-present?</w:t>
-      </w:r>
-    </w:p>
-    <w:p>
-      <w:pPr>
-        <w:pStyle w:val="ListParagraph"/>
-        <w:numPr>
-          <w:ilvl w:val="0"/>
-          <w:numId w:val="2"/>
-        </w:numPr>
-        <w:spacing w:after="90" w:line="276"/>
-      </w:pPr>
-      <w:r>
-        <w:rPr>
-          <w:rFonts w:ascii="Calibri" w:cs="Calibri" w:eastAsia="Calibri" w:hAnsi="Calibri"/>
-          <w:color w:val="16181A"/>
-          <w:sz w:val="22"/>
-          <w:szCs w:val="22"/>
-        </w:rPr>
-        <w:t xml:space="preserve">Is SAP read access a matter of weeks or quarters, and does an existing warehouse extract already carry this data?</w:t>
       </w:r>
     </w:p>
     <w:p>

</xml_diff>

<commit_message>
Remove project-duration timing estimates from the proposal
Dropped every specific week/month duration tied to project
commitments: the 6-8 week / 8-10 week phase estimates (section
headings, summary table, the ask, SME-time ask), and the
history-needed-for-prediction month counts. Reworded each sentence
to keep its point without a specific timeframe. Renamed the summary
table's "Duration" row to "Effort" to match its new content.

Left measurement-unit timeframes alone (IRQ entries per month, hours
per week maintaining a tool, last-12-months write-off figure) since
those define what the metric means, not a project timeline.

Co-Authored-By: Claude Sonnet 5 <noreply@anthropic.com>
</commit_message>
<xml_diff>
--- a/Inbound_Data_Layer_Proposal.docx
+++ b/Inbound_Data_Layer_Proposal.docx
@@ -471,7 +471,7 @@
                 <w:sz w:val="20"/>
                 <w:szCs w:val="20"/>
               </w:rPr>
-              <w:t xml:space="preserve">Duration</w:t>
+              <w:t>Effort</w:t>
             </w:r>
           </w:p>
         </w:tc>
@@ -498,7 +498,7 @@
                 <w:sz w:val="20"/>
                 <w:szCs w:val="20"/>
               </w:rPr>
-              <w:t xml:space="preserve">6 to 8 weeks</w:t>
+              <w:t>Existing engineering time, scoped to inbound only</w:t>
             </w:r>
           </w:p>
         </w:tc>
@@ -778,7 +778,7 @@
                 <w:sz w:val="20"/>
                 <w:szCs w:val="20"/>
               </w:rPr>
-              <w:t>A daily automated SAP export (emailed by logistics, confirmed workable at a 24-hour cadence) for the inbound data set — purchase orders, goods receipts, material and batch master — plus a named supply chain owner, ~2 hours per week of SME time, QA/CSV classification review, and a shared booking mailbox</w:t>
+              <w:t>A daily automated SAP export (emailed by logistics, confirmed workable at a 24-hour cadence) for the inbound data set — purchase orders, goods receipts, material and batch master — plus a named supply chain owner, subject-matter time, QA/CSV classification review, and a shared booking mailbox</w:t>
             </w:r>
           </w:p>
         </w:tc>
@@ -3045,7 +3045,7 @@
           <w:sz w:val="22"/>
           <w:szCs w:val="22"/>
         </w:rPr>
-        <w:t xml:space="preserve">The system is architected to stay outside GxP scope. This is a deliberate design constraint and it is what makes a six to eight week Phase 1 credible.</w:t>
+        <w:t>The system is architected to stay outside GxP scope. This is a deliberate design constraint and it is what makes a lean Phase 1 credible.</w:t>
       </w:r>
     </w:p>
     <w:p>
@@ -3228,16 +3228,15 @@
           <w:sz w:val="22"/>
           <w:szCs w:val="22"/>
         </w:rPr>
-        <w:t xml:space="preserve">Not promised: </w:t>
-      </w:r>
-      <w:r>
-        <w:rPr>
-          <w:rFonts w:ascii="Calibri" w:cs="Calibri" w:eastAsia="Calibri" w:hAnsi="Calibri"/>
-          <w:color w:val="16181A"/>
-          <w:sz w:val="22"/>
-          <w:szCs w:val="22"/>
-        </w:rPr>
-        <w:t xml:space="preserve">late-delivery or excursion-risk prediction. That needs twelve or more months of joined history which does not yet exist. It is an outcome of the earlier phases, not a commitment in any of them.</w:t>
+        <w:t>Not promised: late-delivery or excursion-risk prediction. That needs a substantial amount of joined history which does not yet exist. It is an outcome of the earlier phases, not a commitment in any of them.</w:t>
+      </w:r>
+      <w:r>
+        <w:rPr>
+          <w:rFonts w:ascii="Calibri" w:cs="Calibri" w:eastAsia="Calibri" w:hAnsi="Calibri"/>
+          <w:color w:val="16181A"/>
+          <w:sz w:val="22"/>
+          <w:szCs w:val="22"/>
+        </w:rPr>
       </w:r>
     </w:p>
     <w:p>
@@ -5777,16 +5776,15 @@
           <w:sz w:val="22"/>
           <w:szCs w:val="22"/>
         </w:rPr>
-        <w:t xml:space="preserve">Why inbound first. </w:t>
-      </w:r>
-      <w:r>
-        <w:rPr>
-          <w:rFonts w:ascii="Calibri" w:cs="Calibri" w:eastAsia="Calibri" w:hAnsi="Calibri"/>
-          <w:color w:val="16181A"/>
-          <w:sz w:val="22"/>
-          <w:szCs w:val="22"/>
-        </w:rPr>
-        <w:t xml:space="preserve">It is the smallest domain, it is the one where the duplication has already been measured, and the three-level fan-out from order to batch exercises the hardest part of the model. If the join works on inbound it will work elsewhere; if it does not, that is better discovered in eight weeks than eight months. Outbound is deferred because its eight applications carry approval logic and are better rebuilt against a model that has been proven. Inventory is last because its value is measurement, and measurement needs the history the earlier phases generate — with one exception, the SLED exposure snapshot, which needs no history and is pulled forward into Phase 1.</w:t>
+        <w:t>Why inbound first. It is the smallest domain, it is the one where the duplication has already been measured, and the three-level fan-out from order to batch exercises the hardest part of the model. If the join works on inbound it will work elsewhere; if it does not, that is better discovered early. Outbound is deferred because its eight applications carry approval logic and are better rebuilt against a model that has been proven. Inventory is last because its value is measurement, and measurement needs the history the earlier phases generate — with one exception, the SLED exposure snapshot, which needs no history and is pulled forward into Phase 1.</w:t>
+      </w:r>
+      <w:r>
+        <w:rPr>
+          <w:rFonts w:ascii="Calibri" w:cs="Calibri" w:eastAsia="Calibri" w:hAnsi="Calibri"/>
+          <w:color w:val="16181A"/>
+          <w:sz w:val="22"/>
+          <w:szCs w:val="22"/>
+        </w:rPr>
       </w:r>
     </w:p>
     <w:p>
@@ -5803,7 +5801,7 @@
           <w:sz w:val="24"/>
           <w:szCs w:val="24"/>
         </w:rPr>
-        <w:t xml:space="preserve">7.1 Phase 1 — Inbound (6 to 8 weeks)</w:t>
+        <w:t>7.1 Phase 1 — Inbound</w:t>
       </w:r>
     </w:p>
     <w:p>
@@ -6124,7 +6122,7 @@
           <w:sz w:val="24"/>
           <w:szCs w:val="24"/>
         </w:rPr>
-        <w:t xml:space="preserve">7.2 Phase 2 — Remove the typing (8 to 10 weeks)</w:t>
+        <w:t>7.2 Phase 2 — Remove the typing</w:t>
       </w:r>
     </w:p>
     <w:p>
@@ -6379,7 +6377,7 @@
           <w:sz w:val="22"/>
           <w:szCs w:val="22"/>
         </w:rPr>
-        <w:t xml:space="preserve">Cross-process metrics, second-site pilot, and an assessment of whether prediction is supportable once twelve months of joined history exists.</w:t>
+        <w:t>Cross-process metrics, second-site pilot, and an assessment of whether prediction is supportable once sufficient joined history exists.</w:t>
       </w:r>
     </w:p>
     <w:p>
@@ -6697,7 +6695,7 @@
                 <w:sz w:val="20"/>
                 <w:szCs w:val="20"/>
               </w:rPr>
-              <w:t xml:space="preserve">Build with planning, dock and QC users in the room from week one; carry existing comments over so day one is not empty</w:t>
+              <w:t>Build with planning, dock and QC users in the room from the start; carry existing comments over so day one is not empty</w:t>
             </w:r>
           </w:p>
         </w:tc>
@@ -7348,7 +7346,7 @@
           <w:sz w:val="22"/>
           <w:szCs w:val="22"/>
         </w:rPr>
-        <w:t>Approval of Phase 1 only. No new licences, no new platform. The cost is existing engineering time for six to eight weeks.</w:t>
+        <w:t>Approval of Phase 1 only. No new licences, no new platform. The cost is existing engineering time.</w:t>
       </w:r>
     </w:p>
     <w:p>
@@ -7422,7 +7420,7 @@
           <w:sz w:val="22"/>
           <w:szCs w:val="22"/>
         </w:rPr>
-        <w:t xml:space="preserve">Approximately two hours per week of subject-matter time for eight weeks, from planning, the dock and QC</w:t>
+        <w:t>Subject-matter time from planning, the dock and QC</w:t>
       </w:r>
     </w:p>
     <w:p>
@@ -7624,7 +7622,7 @@
           <w:sz w:val="22"/>
           <w:szCs w:val="22"/>
         </w:rPr>
-        <w:t xml:space="preserve">If the figures come back small, Phase 2 should not proceed, and the cost of establishing that is six to eight weeks of existing engineering time.</w:t>
+        <w:t>If the figures come back small, Phase 2 should not proceed, and the cost of establishing that is existing engineering time.</w:t>
       </w:r>
     </w:p>
     <w:p>

</xml_diff>